<commit_message>
v0.4 FR: Dossier audit mis à jour — MQ-001 + INDEX enrichis (U17-U27 + RECAP), PDF/DOCX régénérés
https://claude.ai/code/session_01KTTozWDUa4jx5mavN2DLaS
</commit_message>
<xml_diff>
--- a/v0.4/fr/audit_0.4/DOSSIER_AUDIT_ISO9001_Plus_Sarl_v0.4.docx
+++ b/v0.4/fr/audit_0.4/DOSSIER_AUDIT_ISO9001_Plus_Sarl_v0.4.docx
@@ -290,7 +290,7 @@
               <w:rPr>
                 <w:sz w:val="20"/>
               </w:rPr>
-              <w:t>20/02/2026</w:t>
+              <w:t>22/02/2026</w:t>
             </w:r>
           </w:p>
         </w:tc>
@@ -505,7 +505,7 @@
                 <w:i w:val="0"/>
                 <w:sz w:val="18"/>
               </w:rPr>
-              <w:t>20/02/2026</w:t>
+              <w:t>22/02/2026</w:t>
             </w:r>
           </w:p>
         </w:tc>
@@ -1717,7 +1717,7 @@
                 <w:i w:val="0"/>
                 <w:sz w:val="18"/>
               </w:rPr>
-              <w:t>Whang</w:t>
+              <w:t>Oukailuo</w:t>
             </w:r>
             <w:r>
               <w:rPr>
@@ -1743,7 +1743,7 @@
                 <w:i w:val="0"/>
                 <w:sz w:val="18"/>
               </w:rPr>
-              <w:t>Fabrication de vis</w:t>
+              <w:t>Visserie et quincaillerie</w:t>
             </w:r>
           </w:p>
         </w:tc>
@@ -2002,7 +2002,16 @@
                 <w:i w:val="0"/>
                 <w:sz w:val="18"/>
               </w:rPr>
-              <w:t>Cloud</w:t>
+              <w:t>Gramatec SA</w:t>
+            </w:r>
+            <w:r>
+              <w:rPr>
+                <w:rFonts w:ascii="Calibri" w:hAnsi="Calibri"/>
+                <w:b w:val="0"/>
+                <w:i w:val="0"/>
+                <w:sz w:val="18"/>
+              </w:rPr>
+              <w:t xml:space="preserve"> (Suisse)</w:t>
             </w:r>
           </w:p>
         </w:tc>
@@ -2019,7 +2028,7 @@
                 <w:i w:val="0"/>
                 <w:sz w:val="18"/>
               </w:rPr>
-              <w:t>Sauvegarde des données, hebergement chez le fournisseur</w:t>
+              <w:t>Hébergement FileMaker, sauvegarde automatique, restauration garantie</w:t>
             </w:r>
           </w:p>
         </w:tc>
@@ -2555,7 +2564,7 @@
                 <w:i w:val="0"/>
                 <w:sz w:val="18"/>
               </w:rPr>
-              <w:t>Diversification fournisseurs en Asie (Whang en place)</w:t>
+              <w:t>Diversification fournisseurs en Asie (Oukailuo en place)</w:t>
             </w:r>
           </w:p>
         </w:tc>
@@ -2723,7 +2732,7 @@
                 <w:i w:val="0"/>
                 <w:sz w:val="18"/>
               </w:rPr>
-              <w:t xml:space="preserve"> (Yuyao Mould Factory, Whang)</w:t>
+              <w:t xml:space="preserve"> (Yuyao Mould Factory, Oukailuo)</w:t>
             </w:r>
           </w:p>
         </w:tc>
@@ -3533,7 +3542,7 @@
                 <w:i w:val="0"/>
                 <w:sz w:val="18"/>
               </w:rPr>
-              <w:t>PRO-ACH-001, FIC-PRO-001</w:t>
+              <w:t>PRO-ACH-001, FIC-PRO-001, FOR-AQF-001, FOR-AQF-002</w:t>
             </w:r>
           </w:p>
         </w:tc>
@@ -4646,7 +4655,7 @@
           <w:b w:val="0"/>
           <w:i w:val="0"/>
         </w:rPr>
-        <w:t>Renforcement du partenariat qualité avec Yuyao Mould Factory et Whang</w:t>
+        <w:t>Renforcement du partenariat qualité avec Yuyao Mould Factory et Oukailuo</w:t>
       </w:r>
     </w:p>
     <w:p>
@@ -5100,7 +5109,7 @@
           <w:b w:val="0"/>
           <w:i w:val="0"/>
         </w:rPr>
-        <w:t xml:space="preserve">La gérante peut réaliser l'audit interne elle-meme. Cependant, il est </w:t>
+        <w:t xml:space="preserve">L'audit interne est réalisé par </w:t>
       </w:r>
       <w:r>
         <w:rPr>
@@ -5108,7 +5117,7 @@
           <w:b/>
           <w:i w:val="0"/>
         </w:rPr>
-        <w:t>fortement recommandé</w:t>
+        <w:t>Capucine Wicky &amp; Olav Wicky</w:t>
       </w:r>
       <w:r>
         <w:rPr>
@@ -5116,7 +5125,7 @@
           <w:b w:val="0"/>
           <w:i w:val="0"/>
         </w:rPr>
-        <w:t xml:space="preserve"> de mandater un auditeur externe indépendant pour respecter l'exigence d'indépendance de la clause 9.2.2 c).</w:t>
+        <w:t xml:space="preserve"> (actionnaires de Plus Sarl). L'exigence d'indépendance de la clause 9.2.2 c) est satisfaite : les auditeurs n'auditent pas leur propre travail.</w:t>
       </w:r>
     </w:p>
     <w:p>
@@ -5487,7 +5496,7 @@
                 <w:i w:val="0"/>
                 <w:sz w:val="18"/>
               </w:rPr>
-              <w:t>Communication renforcee, Whang en second partenaire</w:t>
+              <w:t>Communication renforcee, Oukailuo en second partenaire</w:t>
             </w:r>
           </w:p>
         </w:tc>
@@ -6842,7 +6851,7 @@
                 <w:i w:val="0"/>
                 <w:sz w:val="18"/>
               </w:rPr>
-              <w:t>Sauvegarde cloud</w:t>
+              <w:t>Hébergement Gramatec SA</w:t>
             </w:r>
           </w:p>
         </w:tc>
@@ -6858,7 +6867,7 @@
                 <w:i w:val="0"/>
                 <w:sz w:val="18"/>
               </w:rPr>
-              <w:t>Sauvegarde des données, chez le fournisseur</w:t>
+              <w:t>Sauvegarde automatique FileMaker, restauration garantie (Suisse)</w:t>
             </w:r>
           </w:p>
         </w:tc>
@@ -7024,7 +7033,7 @@
                 <w:i w:val="0"/>
                 <w:sz w:val="18"/>
               </w:rPr>
-              <w:t>Whang</w:t>
+              <w:t>Oukailuo</w:t>
             </w:r>
             <w:r>
               <w:rPr>
@@ -7050,7 +7059,7 @@
                 <w:i w:val="0"/>
                 <w:sz w:val="18"/>
               </w:rPr>
-              <w:t>Vis</w:t>
+              <w:t>Visserie et quincaillerie</w:t>
             </w:r>
           </w:p>
         </w:tc>
@@ -7067,7 +7076,7 @@
                 <w:i w:val="0"/>
                 <w:sz w:val="18"/>
               </w:rPr>
-              <w:t>Accord qualité, évaluation annuelle</w:t>
+              <w:t>Accord qualité (FOR-AQF-002), évaluation annuelle</w:t>
             </w:r>
           </w:p>
         </w:tc>
@@ -7085,7 +7094,16 @@
                 <w:i w:val="0"/>
                 <w:sz w:val="18"/>
               </w:rPr>
-              <w:t>Paradiso</w:t>
+              <w:t>ECAM</w:t>
+            </w:r>
+            <w:r>
+              <w:rPr>
+                <w:rFonts w:ascii="Calibri" w:hAnsi="Calibri"/>
+                <w:b w:val="0"/>
+                <w:i w:val="0"/>
+                <w:sz w:val="18"/>
+              </w:rPr>
+              <w:t xml:space="preserve"> (Chine)</w:t>
             </w:r>
           </w:p>
         </w:tc>
@@ -7101,7 +7119,7 @@
                 <w:i w:val="0"/>
                 <w:sz w:val="18"/>
               </w:rPr>
-              <w:t>Fiduciaire</w:t>
+              <w:t>Transporteur principal, contact Sofia</w:t>
             </w:r>
           </w:p>
         </w:tc>
@@ -7117,7 +7135,7 @@
                 <w:i w:val="0"/>
                 <w:sz w:val="18"/>
               </w:rPr>
-              <w:t>Contrat de mandat</w:t>
+              <w:t>Évaluation très positive depuis des années</w:t>
             </w:r>
           </w:p>
         </w:tc>
@@ -7132,11 +7150,11 @@
             <w:r>
               <w:rPr>
                 <w:rFonts w:ascii="Calibri" w:hAnsi="Calibri"/>
-                <w:b w:val="0"/>
-                <w:i w:val="0"/>
-                <w:sz w:val="18"/>
-              </w:rPr>
-              <w:t>Transitaires</w:t>
+                <w:b/>
+                <w:i w:val="0"/>
+                <w:sz w:val="18"/>
+              </w:rPr>
+              <w:t>Paradiso</w:t>
             </w:r>
           </w:p>
         </w:tc>
@@ -7153,7 +7171,7 @@
                 <w:i w:val="0"/>
                 <w:sz w:val="18"/>
               </w:rPr>
-              <w:t>Transport international</w:t>
+              <w:t>Fiduciaire</w:t>
             </w:r>
           </w:p>
         </w:tc>
@@ -7170,7 +7188,57 @@
                 <w:i w:val="0"/>
                 <w:sz w:val="18"/>
               </w:rPr>
-              <w:t>Suivi par expédition</w:t>
+              <w:t>Contrat de mandat</w:t>
+            </w:r>
+          </w:p>
+        </w:tc>
+      </w:tr>
+      <w:tr>
+        <w:tc>
+          <w:tcPr>
+            <w:tcW w:type="dxa" w:w="3213"/>
+          </w:tcPr>
+          <w:p>
+            <w:r>
+              <w:rPr>
+                <w:rFonts w:ascii="Calibri" w:hAnsi="Calibri"/>
+                <w:b w:val="0"/>
+                <w:i w:val="0"/>
+                <w:sz w:val="18"/>
+              </w:rPr>
+              <w:t>Transitaires</w:t>
+            </w:r>
+          </w:p>
+        </w:tc>
+        <w:tc>
+          <w:tcPr>
+            <w:tcW w:type="dxa" w:w="3213"/>
+          </w:tcPr>
+          <w:p>
+            <w:r>
+              <w:rPr>
+                <w:rFonts w:ascii="Calibri" w:hAnsi="Calibri"/>
+                <w:b w:val="0"/>
+                <w:i w:val="0"/>
+                <w:sz w:val="18"/>
+              </w:rPr>
+              <w:t>Transport international</w:t>
+            </w:r>
+          </w:p>
+        </w:tc>
+        <w:tc>
+          <w:tcPr>
+            <w:tcW w:type="dxa" w:w="3213"/>
+          </w:tcPr>
+          <w:p>
+            <w:r>
+              <w:rPr>
+                <w:rFonts w:ascii="Calibri" w:hAnsi="Calibri"/>
+                <w:b w:val="0"/>
+                <w:i w:val="0"/>
+                <w:sz w:val="18"/>
+              </w:rPr>
+              <w:t>Définis selon prix, qualité ou port d'arrivée</w:t>
             </w:r>
           </w:p>
         </w:tc>
@@ -7276,15 +7344,85 @@
           <w:b/>
           <w:i w:val="0"/>
         </w:rPr>
-        <w:t>Informations en attente :</w:t>
-      </w:r>
+        <w:t>Formation initiale et expérience :</w:t>
+      </w:r>
+    </w:p>
+    <w:p>
+      <w:pPr>
+        <w:pStyle w:val="ListBullet"/>
+      </w:pPr>
       <w:r>
         <w:rPr>
           <w:rFonts w:ascii="Calibri" w:hAnsi="Calibri"/>
           <w:b w:val="0"/>
           <w:i w:val="0"/>
         </w:rPr>
-        <w:t xml:space="preserve"> Diplomes et formations initiales de la gérante non divulgues à ce stade.</w:t>
+        <w:t>Diplôme de commerce (Neuchâtel)</w:t>
+      </w:r>
+    </w:p>
+    <w:p>
+      <w:pPr>
+        <w:pStyle w:val="ListBullet"/>
+      </w:pPr>
+      <w:r>
+        <w:rPr>
+          <w:rFonts w:ascii="Calibri" w:hAnsi="Calibri"/>
+          <w:b w:val="0"/>
+          <w:i w:val="0"/>
+        </w:rPr>
+        <w:t>Diplômes maquillage et esthétique international</w:t>
+      </w:r>
+    </w:p>
+    <w:p>
+      <w:pPr>
+        <w:pStyle w:val="ListBullet"/>
+      </w:pPr>
+      <w:r>
+        <w:rPr>
+          <w:rFonts w:ascii="Calibri" w:hAnsi="Calibri"/>
+          <w:b w:val="0"/>
+          <w:i w:val="0"/>
+        </w:rPr>
+        <w:t>Brevet fédéral esthétique médicale</w:t>
+      </w:r>
+    </w:p>
+    <w:p>
+      <w:pPr>
+        <w:pStyle w:val="ListBullet"/>
+      </w:pPr>
+      <w:r>
+        <w:rPr>
+          <w:rFonts w:ascii="Calibri" w:hAnsi="Calibri"/>
+          <w:b w:val="0"/>
+          <w:i w:val="0"/>
+        </w:rPr>
+        <w:t>Assistante de direction chez Plus Sarl (2013-2016)</w:t>
+      </w:r>
+    </w:p>
+    <w:p>
+      <w:pPr>
+        <w:pStyle w:val="ListBullet"/>
+      </w:pPr>
+      <w:r>
+        <w:rPr>
+          <w:rFonts w:ascii="Calibri" w:hAnsi="Calibri"/>
+          <w:b w:val="0"/>
+          <w:i w:val="0"/>
+        </w:rPr>
+        <w:t>Gérante / Directrice de Plus Sarl (2016-présent)</w:t>
+      </w:r>
+    </w:p>
+    <w:p>
+      <w:pPr>
+        <w:pStyle w:val="ListBullet"/>
+      </w:pPr>
+      <w:r>
+        <w:rPr>
+          <w:rFonts w:ascii="Calibri" w:hAnsi="Calibri"/>
+          <w:b w:val="0"/>
+          <w:i w:val="0"/>
+        </w:rPr>
+        <w:t>Formation sur le terrain en Suisse et en Chine à de nombreuses reprises</w:t>
       </w:r>
     </w:p>
     <w:p>
@@ -7860,7 +7998,7 @@
           <w:b/>
           <w:i w:val="0"/>
         </w:rPr>
-        <w:t>24 documents</w:t>
+        <w:t>26 documents</w:t>
       </w:r>
       <w:r>
         <w:rPr>
@@ -7931,7 +8069,7 @@
           <w:b w:val="0"/>
           <w:i w:val="0"/>
         </w:rPr>
-        <w:t>Sauvegarde cloud automatique</w:t>
+        <w:t>Sauvegarde automatique chez Gramatec SA (Suisse), restauration garantie</w:t>
       </w:r>
     </w:p>
     <w:p>
@@ -7952,6 +8090,28 @@
       <w:r>
         <w:rPr>
           <w:rFonts w:ascii="Calibri" w:hAnsi="Calibri"/>
+          <w:b/>
+          <w:i w:val="0"/>
+        </w:rPr>
+        <w:t>Maîtrise des informations documentées (clause 7.5) :</w:t>
+      </w:r>
+    </w:p>
+    <w:p>
+      <w:pPr/>
+      <w:r>
+        <w:rPr>
+          <w:rFonts w:ascii="Calibri" w:hAnsi="Calibri"/>
+          <w:b w:val="0"/>
+          <w:i w:val="0"/>
+        </w:rPr>
+        <w:t>Plus Sarl veille à assurer l'accessibilité, la lisibilité, la conservation et la protection de toutes les informations documentées. Les données techniques, commerciales et contractuelles sont traitées comme strictement confidentielles. 5 mesures de protection : accès sécurisé, limitation aux interlocuteurs concernés, organisation structurée, protection bases de données, transmission contrôlée.</w:t>
+      </w:r>
+    </w:p>
+    <w:p>
+      <w:pPr/>
+      <w:r>
+        <w:rPr>
+          <w:rFonts w:ascii="Calibri" w:hAnsi="Calibri"/>
           <w:b w:val="0"/>
           <w:i w:val="0"/>
         </w:rPr>
@@ -8180,6 +8340,146 @@
       </w:pPr>
       <w:r>
         <w:t>8.2 Exigences relatives aux produits et services</w:t>
+      </w:r>
+    </w:p>
+    <w:p>
+      <w:pPr>
+        <w:pStyle w:val="Heading4"/>
+      </w:pPr>
+      <w:r>
+        <w:t>Détermination des exigences (clause 8.2)</w:t>
+      </w:r>
+    </w:p>
+    <w:p>
+      <w:pPr/>
+      <w:r>
+        <w:rPr>
+          <w:rFonts w:ascii="Calibri" w:hAnsi="Calibri"/>
+          <w:b w:val="0"/>
+          <w:i w:val="0"/>
+        </w:rPr>
+        <w:t xml:space="preserve">Plus Sarl détermine </w:t>
+      </w:r>
+      <w:r>
+        <w:rPr>
+          <w:rFonts w:ascii="Calibri" w:hAnsi="Calibri"/>
+          <w:b/>
+          <w:i w:val="0"/>
+        </w:rPr>
+        <w:t>6 types d'exigences</w:t>
+      </w:r>
+      <w:r>
+        <w:rPr>
+          <w:rFonts w:ascii="Calibri" w:hAnsi="Calibri"/>
+          <w:b w:val="0"/>
+          <w:i w:val="0"/>
+        </w:rPr>
+        <w:t xml:space="preserve"> applicables à chaque commande :</w:t>
+      </w:r>
+    </w:p>
+    <w:p>
+      <w:pPr>
+        <w:pStyle w:val="ListNumber"/>
+      </w:pPr>
+      <w:r>
+        <w:rPr>
+          <w:rFonts w:ascii="Calibri" w:hAnsi="Calibri"/>
+          <w:b w:val="0"/>
+          <w:i w:val="0"/>
+        </w:rPr>
+        <w:t>Spécifications techniques (plans, matières, tolérances)</w:t>
+      </w:r>
+    </w:p>
+    <w:p>
+      <w:pPr>
+        <w:pStyle w:val="ListNumber"/>
+      </w:pPr>
+      <w:r>
+        <w:rPr>
+          <w:rFonts w:ascii="Calibri" w:hAnsi="Calibri"/>
+          <w:b w:val="0"/>
+          <w:i w:val="0"/>
+        </w:rPr>
+        <w:t>Quantités et délais</w:t>
+      </w:r>
+    </w:p>
+    <w:p>
+      <w:pPr>
+        <w:pStyle w:val="ListNumber"/>
+      </w:pPr>
+      <w:r>
+        <w:rPr>
+          <w:rFonts w:ascii="Calibri" w:hAnsi="Calibri"/>
+          <w:b w:val="0"/>
+          <w:i w:val="0"/>
+        </w:rPr>
+        <w:t>Exigences légales et réglementaires (douanes, normes)</w:t>
+      </w:r>
+    </w:p>
+    <w:p>
+      <w:pPr>
+        <w:pStyle w:val="ListNumber"/>
+      </w:pPr>
+      <w:r>
+        <w:rPr>
+          <w:rFonts w:ascii="Calibri" w:hAnsi="Calibri"/>
+          <w:b w:val="0"/>
+          <w:i w:val="0"/>
+        </w:rPr>
+        <w:t>Normes applicables</w:t>
+      </w:r>
+    </w:p>
+    <w:p>
+      <w:pPr>
+        <w:pStyle w:val="ListNumber"/>
+      </w:pPr>
+      <w:r>
+        <w:rPr>
+          <w:rFonts w:ascii="Calibri" w:hAnsi="Calibri"/>
+          <w:b w:val="0"/>
+          <w:i w:val="0"/>
+        </w:rPr>
+        <w:t>Conditions de livraison</w:t>
+      </w:r>
+    </w:p>
+    <w:p>
+      <w:pPr>
+        <w:pStyle w:val="ListNumber"/>
+      </w:pPr>
+      <w:r>
+        <w:rPr>
+          <w:rFonts w:ascii="Calibri" w:hAnsi="Calibri"/>
+          <w:b w:val="0"/>
+          <w:i w:val="0"/>
+        </w:rPr>
+        <w:t>Exigences implicites (emballage, marquage, certificats)</w:t>
+      </w:r>
+    </w:p>
+    <w:p>
+      <w:pPr/>
+      <w:r>
+        <w:rPr>
+          <w:rFonts w:ascii="Calibri" w:hAnsi="Calibri"/>
+          <w:b w:val="0"/>
+          <w:i w:val="0"/>
+        </w:rPr>
+        <w:t xml:space="preserve">Plus Sarl se réserve la </w:t>
+      </w:r>
+      <w:r>
+        <w:rPr>
+          <w:rFonts w:ascii="Calibri" w:hAnsi="Calibri"/>
+          <w:b/>
+          <w:i w:val="0"/>
+        </w:rPr>
+        <w:t>possibilité de refuser</w:t>
+      </w:r>
+      <w:r>
+        <w:rPr>
+          <w:rFonts w:ascii="Calibri" w:hAnsi="Calibri"/>
+          <w:b w:val="0"/>
+          <w:i w:val="0"/>
+        </w:rPr>
+        <w:t xml:space="preserve"> une commande hors de son domaine de compétence (clause 8.1).</w:t>
       </w:r>
     </w:p>
     <w:p>
@@ -8298,7 +8598,7 @@
                 <w:i w:val="0"/>
                 <w:sz w:val="18"/>
               </w:rPr>
-              <w:t>Références, quantités, délais</w:t>
+              <w:t>Détermination des 6 types d'exigences</w:t>
             </w:r>
           </w:p>
         </w:tc>
@@ -8400,7 +8700,7 @@
           <w:b w:val="0"/>
           <w:i w:val="0"/>
         </w:rPr>
-        <w:t>Apres validation : enregistrement dans FileMaker, accusé de reception au client.</w:t>
+        <w:t>Après validation : enregistrement dans FileMaker, accusé de réception au client.</w:t>
       </w:r>
     </w:p>
     <w:p>
@@ -8411,7 +8711,7 @@
           <w:b w:val="0"/>
           <w:i w:val="0"/>
         </w:rPr>
-        <w:t>Toute modification est soumise a analyse, validation partenaire si nécessaire, confirmation client par email et mise à jour FileMaker.</w:t>
+        <w:t>Toute modification est soumise à analyse, validation partenaire si nécessaire, confirmation client par email et mise à jour FileMaker.</w:t>
       </w:r>
     </w:p>
     <w:p>
@@ -8481,7 +8781,23 @@
           <w:b w:val="0"/>
           <w:i w:val="0"/>
         </w:rPr>
-        <w:t xml:space="preserve"> : partenaires experimentes, capacité technique évaluée</w:t>
+        <w:t xml:space="preserve"> sur </w:t>
+      </w:r>
+      <w:r>
+        <w:rPr>
+          <w:rFonts w:ascii="Calibri" w:hAnsi="Calibri"/>
+          <w:b/>
+          <w:i w:val="0"/>
+        </w:rPr>
+        <w:t>7 critères</w:t>
+      </w:r>
+      <w:r>
+        <w:rPr>
+          <w:rFonts w:ascii="Calibri" w:hAnsi="Calibri"/>
+          <w:b w:val="0"/>
+          <w:i w:val="0"/>
+        </w:rPr>
+        <w:t xml:space="preserve"> : capacité technique, qualité, réactivité, fiabilité, prix, communication, flexibilité</w:t>
       </w:r>
     </w:p>
     <w:p>
@@ -8523,7 +8839,23 @@
           <w:b w:val="0"/>
           <w:i w:val="0"/>
         </w:rPr>
-        <w:t xml:space="preserve"> : évaluation annuelle des fournisseurs (FOR-EVF-001), suivi des indicateurs (délais, conformité)</w:t>
+        <w:t xml:space="preserve"> sur </w:t>
+      </w:r>
+      <w:r>
+        <w:rPr>
+          <w:rFonts w:ascii="Calibri" w:hAnsi="Calibri"/>
+          <w:b/>
+          <w:i w:val="0"/>
+        </w:rPr>
+        <w:t>4 indicateurs</w:t>
+      </w:r>
+      <w:r>
+        <w:rPr>
+          <w:rFonts w:ascii="Calibri" w:hAnsi="Calibri"/>
+          <w:b w:val="0"/>
+          <w:i w:val="0"/>
+        </w:rPr>
+        <w:t xml:space="preserve"> : respect des délais, conformité des pièces, stabilité relation, réactivité</w:t>
       </w:r>
     </w:p>
     <w:p>
@@ -8544,57 +8876,121 @@
           <w:b w:val="0"/>
           <w:i w:val="0"/>
         </w:rPr>
-        <w:t xml:space="preserve"> : contrôle qualité pre-expédition par le partenaire, échantillons valides</w:t>
-      </w:r>
-    </w:p>
-    <w:p>
-      <w:pPr/>
+        <w:t xml:space="preserve"> : contrôle qualité pré-expédition par le partenaire, échantillons validés</w:t>
+      </w:r>
+    </w:p>
+    <w:p>
+      <w:pPr>
+        <w:pStyle w:val="ListBullet"/>
+      </w:pPr>
+      <w:r>
+        <w:rPr>
+          <w:rFonts w:ascii="Calibri" w:hAnsi="Calibri"/>
+          <w:b/>
+          <w:i w:val="0"/>
+        </w:rPr>
+        <w:t>Validation outillages</w:t>
+      </w:r>
       <w:r>
         <w:rPr>
           <w:rFonts w:ascii="Calibri" w:hAnsi="Calibri"/>
           <w:b w:val="0"/>
           <w:i w:val="0"/>
         </w:rPr>
-        <w:t>Les critères d'évaluation continue incluent :</w:t>
+        <w:t xml:space="preserve"> : tout nouveau moule validé sur échantillon avant lancement série</w:t>
       </w:r>
     </w:p>
     <w:p>
       <w:pPr>
         <w:pStyle w:val="ListBullet"/>
       </w:pPr>
+      <w:r>
+        <w:rPr>
+          <w:rFonts w:ascii="Calibri" w:hAnsi="Calibri"/>
+          <w:b/>
+          <w:i w:val="0"/>
+        </w:rPr>
+        <w:t>Confidentialité</w:t>
+      </w:r>
       <w:r>
         <w:rPr>
           <w:rFonts w:ascii="Calibri" w:hAnsi="Calibri"/>
           <w:b w:val="0"/>
           <w:i w:val="0"/>
         </w:rPr>
-        <w:t>Respect des délais (continu, par commande)</w:t>
+        <w:t xml:space="preserve"> : propriété intellectuelle des clients protégée par les accords qualité</w:t>
+      </w:r>
+    </w:p>
+    <w:p>
+      <w:pPr/>
+      <w:r>
+        <w:rPr>
+          <w:rFonts w:ascii="Calibri" w:hAnsi="Calibri"/>
+          <w:b/>
+          <w:i w:val="0"/>
+        </w:rPr>
+        <w:t>Accords qualité formalisés :</w:t>
       </w:r>
     </w:p>
     <w:p>
       <w:pPr>
         <w:pStyle w:val="ListBullet"/>
       </w:pPr>
+      <w:r>
+        <w:rPr>
+          <w:rFonts w:ascii="Calibri" w:hAnsi="Calibri"/>
+          <w:b/>
+          <w:i w:val="0"/>
+        </w:rPr>
+        <w:t>FOR-AQF-001</w:t>
+      </w:r>
       <w:r>
         <w:rPr>
           <w:rFonts w:ascii="Calibri" w:hAnsi="Calibri"/>
           <w:b w:val="0"/>
           <w:i w:val="0"/>
         </w:rPr>
-        <w:t>Conformité des pièces livrées (a chaque reception)</w:t>
+        <w:t xml:space="preserve"> — Accord qualité avec Hardeng Yuyao Mould Factory (10 sections)</w:t>
       </w:r>
     </w:p>
     <w:p>
       <w:pPr>
         <w:pStyle w:val="ListBullet"/>
       </w:pPr>
+      <w:r>
+        <w:rPr>
+          <w:rFonts w:ascii="Calibri" w:hAnsi="Calibri"/>
+          <w:b/>
+          <w:i w:val="0"/>
+        </w:rPr>
+        <w:t>FOR-AQF-002</w:t>
+      </w:r>
       <w:r>
         <w:rPr>
           <w:rFonts w:ascii="Calibri" w:hAnsi="Calibri"/>
           <w:b w:val="0"/>
           <w:i w:val="0"/>
         </w:rPr>
-        <w:t>Stabilité de la relation industrielle (annuel)</w:t>
+        <w:t xml:space="preserve"> — Accord qualité avec Oukailuo (10 sections)</w:t>
+      </w:r>
+    </w:p>
+    <w:p>
+      <w:pPr/>
+      <w:r>
+        <w:rPr>
+          <w:rFonts w:ascii="Calibri" w:hAnsi="Calibri"/>
+          <w:b/>
+          <w:i w:val="0"/>
+        </w:rPr>
+        <w:t>Transporteur principal :</w:t>
+      </w:r>
+      <w:r>
+        <w:rPr>
+          <w:rFonts w:ascii="Calibri" w:hAnsi="Calibri"/>
+          <w:b w:val="0"/>
+          <w:i w:val="0"/>
+        </w:rPr>
+        <w:t xml:space="preserve"> ECAM (Chine), contact Sofia (WeChat/email). Évaluation très positive depuis des années. Transitaires définis selon prix, qualité ou port d'arrivée.</w:t>
       </w:r>
     </w:p>
     <w:p>
@@ -8605,7 +9001,7 @@
           <w:b w:val="0"/>
           <w:i/>
         </w:rPr>
-        <w:t>(cf. PRO-ACH-001, FIC-PRO-001, FOR-EVF-001)</w:t>
+        <w:t>(cf. PRO-ACH-001, FIC-PRO-001, FOR-EVF-001, FOR-AQF-001, FOR-AQF-002)</w:t>
       </w:r>
     </w:p>
     <w:p>
@@ -8698,6 +9094,69 @@
           <w:b/>
           <w:i w:val="0"/>
         </w:rPr>
+        <w:t>4 moyens de conformité pour la production externalisée (clause 8.5) :</w:t>
+      </w:r>
+    </w:p>
+    <w:p>
+      <w:pPr>
+        <w:pStyle w:val="ListNumber"/>
+      </w:pPr>
+      <w:r>
+        <w:rPr>
+          <w:rFonts w:ascii="Calibri" w:hAnsi="Calibri"/>
+          <w:b w:val="0"/>
+          <w:i w:val="0"/>
+        </w:rPr>
+        <w:t>Transmission des spécifications techniques complètes</w:t>
+      </w:r>
+    </w:p>
+    <w:p>
+      <w:pPr>
+        <w:pStyle w:val="ListNumber"/>
+      </w:pPr>
+      <w:r>
+        <w:rPr>
+          <w:rFonts w:ascii="Calibri" w:hAnsi="Calibri"/>
+          <w:b w:val="0"/>
+          <w:i w:val="0"/>
+        </w:rPr>
+        <w:t>Suivi de production (photos, rapports d'étape, WeChat)</w:t>
+      </w:r>
+    </w:p>
+    <w:p>
+      <w:pPr>
+        <w:pStyle w:val="ListNumber"/>
+      </w:pPr>
+      <w:r>
+        <w:rPr>
+          <w:rFonts w:ascii="Calibri" w:hAnsi="Calibri"/>
+          <w:b w:val="0"/>
+          <w:i w:val="0"/>
+        </w:rPr>
+        <w:t>Contrôle qualité pré-expédition par le partenaire</w:t>
+      </w:r>
+    </w:p>
+    <w:p>
+      <w:pPr>
+        <w:pStyle w:val="ListNumber"/>
+      </w:pPr>
+      <w:r>
+        <w:rPr>
+          <w:rFonts w:ascii="Calibri" w:hAnsi="Calibri"/>
+          <w:b w:val="0"/>
+          <w:i w:val="0"/>
+        </w:rPr>
+        <w:t>Envoi d'échantillons chez Plus Sarl en parallèle du transport</w:t>
+      </w:r>
+    </w:p>
+    <w:p>
+      <w:pPr/>
+      <w:r>
+        <w:rPr>
+          <w:rFonts w:ascii="Calibri" w:hAnsi="Calibri"/>
+          <w:b/>
+          <w:i w:val="0"/>
+        </w:rPr>
         <w:t>Processus O3 — Logistique et livraison :</w:t>
       </w:r>
     </w:p>
@@ -8837,59 +9296,97 @@
           <w:b w:val="0"/>
           <w:i w:val="0"/>
         </w:rPr>
-        <w:t>Avant expédition, Plus Sarl s'assure de la conformité des pièces :</w:t>
-      </w:r>
-    </w:p>
-    <w:p>
-      <w:pPr>
-        <w:pStyle w:val="ListBullet"/>
-      </w:pPr>
+        <w:t xml:space="preserve">Avant expédition, Plus Sarl s'assure de la conformité par une </w:t>
+      </w:r>
+      <w:r>
+        <w:rPr>
+          <w:rFonts w:ascii="Calibri" w:hAnsi="Calibri"/>
+          <w:b/>
+          <w:i w:val="0"/>
+        </w:rPr>
+        <w:t>libération formalisée sur 3 critères</w:t>
+      </w:r>
       <w:r>
         <w:rPr>
           <w:rFonts w:ascii="Calibri" w:hAnsi="Calibri"/>
           <w:b w:val="0"/>
           <w:i w:val="0"/>
         </w:rPr>
-        <w:t>vérification de la conformité aux exigences techniques</w:t>
-      </w:r>
-    </w:p>
-    <w:p>
-      <w:pPr>
-        <w:pStyle w:val="ListBullet"/>
-      </w:pPr>
+        <w:t xml:space="preserve"> (clause 8.6) :</w:t>
+      </w:r>
+    </w:p>
+    <w:p>
+      <w:pPr>
+        <w:pStyle w:val="ListNumber"/>
+      </w:pPr>
+      <w:r>
+        <w:rPr>
+          <w:rFonts w:ascii="Calibri" w:hAnsi="Calibri"/>
+          <w:b/>
+          <w:i w:val="0"/>
+        </w:rPr>
+        <w:t>CQ fabricant conforme</w:t>
+      </w:r>
       <w:r>
         <w:rPr>
           <w:rFonts w:ascii="Calibri" w:hAnsi="Calibri"/>
           <w:b w:val="0"/>
           <w:i w:val="0"/>
         </w:rPr>
-        <w:t>contrôle qualité réalisé par le fabricant  [À VÉRIFIER — fiche de contrôle a formaliser]</w:t>
-      </w:r>
-    </w:p>
-    <w:p>
-      <w:pPr>
-        <w:pStyle w:val="ListBullet"/>
-      </w:pPr>
+        <w:t xml:space="preserve"> — le partenaire réalise un contrôle qualité interne avant expédition</w:t>
+      </w:r>
+    </w:p>
+    <w:p>
+      <w:pPr>
+        <w:pStyle w:val="ListNumber"/>
+      </w:pPr>
+      <w:r>
+        <w:rPr>
+          <w:rFonts w:ascii="Calibri" w:hAnsi="Calibri"/>
+          <w:b/>
+          <w:i w:val="0"/>
+        </w:rPr>
+        <w:t>Confirmation correspondance avec la commande</w:t>
+      </w:r>
       <w:r>
         <w:rPr>
           <w:rFonts w:ascii="Calibri" w:hAnsi="Calibri"/>
           <w:b w:val="0"/>
           <w:i w:val="0"/>
         </w:rPr>
-        <w:t>suivi documentaire conserve sur FileMaker</w:t>
-      </w:r>
-    </w:p>
-    <w:p>
-      <w:pPr>
-        <w:pStyle w:val="ListBullet"/>
-      </w:pPr>
+        <w:t xml:space="preserve"> — vérification que la production correspond aux spécifications</w:t>
+      </w:r>
+    </w:p>
+    <w:p>
+      <w:pPr>
+        <w:pStyle w:val="ListNumber"/>
+      </w:pPr>
+      <w:r>
+        <w:rPr>
+          <w:rFonts w:ascii="Calibri" w:hAnsi="Calibri"/>
+          <w:b/>
+          <w:i w:val="0"/>
+        </w:rPr>
+        <w:t>Photos des pièces et de l'emballage</w:t>
+      </w:r>
       <w:r>
         <w:rPr>
           <w:rFonts w:ascii="Calibri" w:hAnsi="Calibri"/>
           <w:b w:val="0"/>
           <w:i w:val="0"/>
         </w:rPr>
-        <w:t>analyse des retours clients après livraison</w:t>
+        <w:t xml:space="preserve"> — preuve visuelle de conformité</w:t>
+      </w:r>
+    </w:p>
+    <w:p>
+      <w:pPr/>
+      <w:r>
+        <w:rPr>
+          <w:rFonts w:ascii="Calibri" w:hAnsi="Calibri"/>
+          <w:b w:val="0"/>
+          <w:i w:val="0"/>
+        </w:rPr>
+        <w:t>En complément : envoi d'échantillons chez Plus Sarl en parallèle du transport. Suivi documentaire conservé sur FileMaker. Analyse des retours clients après livraison.</w:t>
       </w:r>
     </w:p>
     <w:p>
@@ -8919,59 +9416,107 @@
           <w:b w:val="0"/>
           <w:i w:val="0"/>
         </w:rPr>
-        <w:t>En cas de non-conformité identifiée :</w:t>
-      </w:r>
-    </w:p>
-    <w:p>
-      <w:pPr>
-        <w:pStyle w:val="ListNumber"/>
-      </w:pPr>
+        <w:t xml:space="preserve">En cas de non-conformité identifiée, </w:t>
+      </w:r>
+      <w:r>
+        <w:rPr>
+          <w:rFonts w:ascii="Calibri" w:hAnsi="Calibri"/>
+          <w:b/>
+          <w:i w:val="0"/>
+        </w:rPr>
+        <w:t>processus en 4 étapes</w:t>
+      </w:r>
       <w:r>
         <w:rPr>
           <w:rFonts w:ascii="Calibri" w:hAnsi="Calibri"/>
           <w:b w:val="0"/>
           <w:i w:val="0"/>
         </w:rPr>
-        <w:t>Création d'une fiche de non-conformité</w:t>
+        <w:t xml:space="preserve"> (clause 8.7) :</w:t>
       </w:r>
     </w:p>
     <w:p>
       <w:pPr>
         <w:pStyle w:val="ListNumber"/>
       </w:pPr>
+      <w:r>
+        <w:rPr>
+          <w:rFonts w:ascii="Calibri" w:hAnsi="Calibri"/>
+          <w:b/>
+          <w:i w:val="0"/>
+        </w:rPr>
+        <w:t>Identification et isolement</w:t>
+      </w:r>
       <w:r>
         <w:rPr>
           <w:rFonts w:ascii="Calibri" w:hAnsi="Calibri"/>
           <w:b w:val="0"/>
           <w:i w:val="0"/>
         </w:rPr>
-        <w:t>Decision : acceptation, remplacement ou correction</w:t>
+        <w:t xml:space="preserve"> du lot concerné</w:t>
       </w:r>
     </w:p>
     <w:p>
       <w:pPr>
         <w:pStyle w:val="ListNumber"/>
       </w:pPr>
+      <w:r>
+        <w:rPr>
+          <w:rFonts w:ascii="Calibri" w:hAnsi="Calibri"/>
+          <w:b/>
+          <w:i w:val="0"/>
+        </w:rPr>
+        <w:t>Analyse de la NC</w:t>
+      </w:r>
       <w:r>
         <w:rPr>
           <w:rFonts w:ascii="Calibri" w:hAnsi="Calibri"/>
           <w:b w:val="0"/>
           <w:i w:val="0"/>
         </w:rPr>
-        <w:t>Analyse de la cause et investigation</w:t>
+        <w:t xml:space="preserve"> et décision de traitement (acceptation, remplacement, correction)</w:t>
       </w:r>
     </w:p>
     <w:p>
       <w:pPr>
         <w:pStyle w:val="ListNumber"/>
       </w:pPr>
+      <w:r>
+        <w:rPr>
+          <w:rFonts w:ascii="Calibri" w:hAnsi="Calibri"/>
+          <w:b/>
+          <w:i w:val="0"/>
+        </w:rPr>
+        <w:t>Actions correctives</w:t>
+      </w:r>
       <w:r>
         <w:rPr>
           <w:rFonts w:ascii="Calibri" w:hAnsi="Calibri"/>
           <w:b w:val="0"/>
           <w:i w:val="0"/>
         </w:rPr>
-        <w:t>Mise en œuvre d'actions correctives pour eviter la répétition</w:t>
+        <w:t xml:space="preserve"> (cf. PRO-NCF-001, PRO-ACR-001)</w:t>
+      </w:r>
+    </w:p>
+    <w:p>
+      <w:pPr>
+        <w:pStyle w:val="ListNumber"/>
+      </w:pPr>
+      <w:r>
+        <w:rPr>
+          <w:rFonts w:ascii="Calibri" w:hAnsi="Calibri"/>
+          <w:b/>
+          <w:i w:val="0"/>
+        </w:rPr>
+        <w:t>Enregistrement</w:t>
+      </w:r>
+      <w:r>
+        <w:rPr>
+          <w:rFonts w:ascii="Calibri" w:hAnsi="Calibri"/>
+          <w:b w:val="0"/>
+          <w:i w:val="0"/>
+        </w:rPr>
+        <w:t xml:space="preserve"> dans le registre NC FileMaker  [À VÉRIFIER — registre à mettre en place]</w:t>
       </w:r>
     </w:p>
     <w:p>
@@ -9009,7 +9554,128 @@
           <w:b w:val="0"/>
           <w:i w:val="0"/>
         </w:rPr>
-        <w:t>Le suivi de la performance du SMQ s'appuie sur :</w:t>
+        <w:t xml:space="preserve">Le suivi de la performance du SMQ s'appuie sur </w:t>
+      </w:r>
+      <w:r>
+        <w:rPr>
+          <w:rFonts w:ascii="Calibri" w:hAnsi="Calibri"/>
+          <w:b/>
+          <w:i w:val="0"/>
+        </w:rPr>
+        <w:t>5 volets de suivi, mesure, analyse et évaluation</w:t>
+      </w:r>
+      <w:r>
+        <w:rPr>
+          <w:rFonts w:ascii="Calibri" w:hAnsi="Calibri"/>
+          <w:b w:val="0"/>
+          <w:i w:val="0"/>
+        </w:rPr>
+        <w:t xml:space="preserve"> (clause 9.1) :</w:t>
+      </w:r>
+    </w:p>
+    <w:p>
+      <w:pPr>
+        <w:pStyle w:val="ListNumber"/>
+      </w:pPr>
+      <w:r>
+        <w:rPr>
+          <w:rFonts w:ascii="Calibri" w:hAnsi="Calibri"/>
+          <w:b/>
+          <w:i w:val="0"/>
+        </w:rPr>
+        <w:t>Suivi des délais</w:t>
+      </w:r>
+      <w:r>
+        <w:rPr>
+          <w:rFonts w:ascii="Calibri" w:hAnsi="Calibri"/>
+          <w:b w:val="0"/>
+          <w:i w:val="0"/>
+        </w:rPr>
+        <w:t xml:space="preserve"> : transport maritime/ferroviaire (+/-10 jours), aérien (+/-3 jours)</w:t>
+      </w:r>
+    </w:p>
+    <w:p>
+      <w:pPr>
+        <w:pStyle w:val="ListNumber"/>
+      </w:pPr>
+      <w:r>
+        <w:rPr>
+          <w:rFonts w:ascii="Calibri" w:hAnsi="Calibri"/>
+          <w:b/>
+          <w:i w:val="0"/>
+        </w:rPr>
+        <w:t>Conformité produit</w:t>
+      </w:r>
+      <w:r>
+        <w:rPr>
+          <w:rFonts w:ascii="Calibri" w:hAnsi="Calibri"/>
+          <w:b w:val="0"/>
+          <w:i w:val="0"/>
+        </w:rPr>
+        <w:t xml:space="preserve"> : taux de conformité &gt;= 95%, max 3 NC/client/an</w:t>
+      </w:r>
+    </w:p>
+    <w:p>
+      <w:pPr>
+        <w:pStyle w:val="ListNumber"/>
+      </w:pPr>
+      <w:r>
+        <w:rPr>
+          <w:rFonts w:ascii="Calibri" w:hAnsi="Calibri"/>
+          <w:b/>
+          <w:i w:val="0"/>
+        </w:rPr>
+        <w:t>Performance fournisseurs</w:t>
+      </w:r>
+      <w:r>
+        <w:rPr>
+          <w:rFonts w:ascii="Calibri" w:hAnsi="Calibri"/>
+          <w:b w:val="0"/>
+          <w:i w:val="0"/>
+        </w:rPr>
+        <w:t xml:space="preserve"> : évaluation continue (délais, conformité, stabilité, réactivité)</w:t>
+      </w:r>
+    </w:p>
+    <w:p>
+      <w:pPr>
+        <w:pStyle w:val="ListNumber"/>
+      </w:pPr>
+      <w:r>
+        <w:rPr>
+          <w:rFonts w:ascii="Calibri" w:hAnsi="Calibri"/>
+          <w:b/>
+          <w:i w:val="0"/>
+        </w:rPr>
+        <w:t>Satisfaction client</w:t>
+      </w:r>
+      <w:r>
+        <w:rPr>
+          <w:rFonts w:ascii="Calibri" w:hAnsi="Calibri"/>
+          <w:b w:val="0"/>
+          <w:i w:val="0"/>
+        </w:rPr>
+        <w:t xml:space="preserve"> : absence de réclamation majeure, retours qualitatifs, fidélisation</w:t>
+      </w:r>
+    </w:p>
+    <w:p>
+      <w:pPr>
+        <w:pStyle w:val="ListNumber"/>
+      </w:pPr>
+      <w:r>
+        <w:rPr>
+          <w:rFonts w:ascii="Calibri" w:hAnsi="Calibri"/>
+          <w:b/>
+          <w:i w:val="0"/>
+        </w:rPr>
+        <w:t>Fréquence d'analyse</w:t>
+      </w:r>
+      <w:r>
+        <w:rPr>
+          <w:rFonts w:ascii="Calibri" w:hAnsi="Calibri"/>
+          <w:b w:val="0"/>
+          <w:i w:val="0"/>
+        </w:rPr>
+        <w:t xml:space="preserve"> : trimestrielle (indicateurs), annuelle (revue de direction, audit)</w:t>
       </w:r>
     </w:p>
     <w:p>
@@ -9086,7 +9752,7 @@
                 <w:color w:val="FFFFFF"/>
                 <w:sz w:val="18"/>
               </w:rPr>
-              <w:t>Frequence</w:t>
+              <w:t>Fréquence</w:t>
             </w:r>
           </w:p>
         </w:tc>
@@ -9207,7 +9873,7 @@
                 <w:i w:val="0"/>
                 <w:sz w:val="18"/>
               </w:rPr>
-              <w:t>Validation des offres sans reneg. majeure</w:t>
+              <w:t>Validation des offres sans renég. majeure</w:t>
             </w:r>
           </w:p>
         </w:tc>
@@ -9357,7 +10023,7 @@
           <w:b w:val="0"/>
           <w:i/>
         </w:rPr>
-        <w:t>(cf. OBJ-QUA-001 §2)</w:t>
+        <w:t>(cf. OBJ-QUA-001 §2, §4)</w:t>
       </w:r>
     </w:p>
     <w:p>
@@ -9510,7 +10176,7 @@
                 <w:i w:val="0"/>
                 <w:sz w:val="18"/>
               </w:rPr>
-              <w:t>Frequence</w:t>
+              <w:t>Fréquence</w:t>
             </w:r>
           </w:p>
         </w:tc>
@@ -9545,7 +10211,7 @@
                 <w:i w:val="0"/>
                 <w:sz w:val="18"/>
               </w:rPr>
-              <w:t>Responsable</w:t>
+              <w:t>Auditeurs</w:t>
             </w:r>
           </w:p>
         </w:tc>
@@ -9558,11 +10224,20 @@
             <w:r>
               <w:rPr>
                 <w:rFonts w:ascii="Calibri" w:hAnsi="Calibri"/>
-                <w:b w:val="0"/>
-                <w:i w:val="0"/>
-                <w:sz w:val="18"/>
-              </w:rPr>
-              <w:t>Gérante ou auditeur externe indépendant</w:t>
+                <w:b/>
+                <w:i w:val="0"/>
+                <w:sz w:val="18"/>
+              </w:rPr>
+              <w:t>Capucine Wicky &amp; Olav Wicky</w:t>
+            </w:r>
+            <w:r>
+              <w:rPr>
+                <w:rFonts w:ascii="Calibri" w:hAnsi="Calibri"/>
+                <w:b w:val="0"/>
+                <w:i w:val="0"/>
+                <w:sz w:val="18"/>
+              </w:rPr>
+              <w:t xml:space="preserve"> (actionnaires de Plus Sarl)</w:t>
             </w:r>
           </w:p>
         </w:tc>
@@ -9613,7 +10288,7 @@
           <w:b/>
           <w:i/>
         </w:rPr>
-        <w:t>Recommandation forte :</w:t>
+        <w:t>Exigence d'indépendance satisfaite</w:t>
       </w:r>
       <w:r>
         <w:rPr>
@@ -9621,7 +10296,7 @@
           <w:b w:val="0"/>
           <w:i w:val="0"/>
         </w:rPr>
-        <w:t xml:space="preserve"> dans une organisation unipersonnelle, il est recommandé de mandater un auditeur externe indépendant pour respecter l'exigence d'indépendance (clause 9.2.2 c).</w:t>
+        <w:t xml:space="preserve"> (clause 9.2.2 c) : les auditeurs internes sont les actionnaires Capucine et Olav Wicky, qui n'exercent pas d'activité opérationnelle dans l'entreprise.</w:t>
       </w:r>
     </w:p>
     <w:p>
@@ -9667,135 +10342,137 @@
           <w:b w:val="0"/>
           <w:i w:val="0"/>
         </w:rPr>
-        <w:t xml:space="preserve"> par Roxane Wicky.</w:t>
-      </w:r>
-    </w:p>
-    <w:p>
-      <w:pPr/>
+        <w:t xml:space="preserve"> par Roxane Wicky. Elle vise à s'assurer de la </w:t>
+      </w:r>
       <w:r>
         <w:rPr>
           <w:rFonts w:ascii="Calibri" w:hAnsi="Calibri"/>
           <w:b/>
           <w:i w:val="0"/>
         </w:rPr>
-        <w:t>Éléments examines :</w:t>
-      </w:r>
-    </w:p>
-    <w:p>
-      <w:pPr>
-        <w:pStyle w:val="ListBullet"/>
-      </w:pPr>
+        <w:t>pertinence</w:t>
+      </w:r>
       <w:r>
         <w:rPr>
           <w:rFonts w:ascii="Calibri" w:hAnsi="Calibri"/>
           <w:b w:val="0"/>
           <w:i w:val="0"/>
         </w:rPr>
-        <w:t>État des actions des revues précédentes</w:t>
-      </w:r>
-    </w:p>
-    <w:p>
-      <w:pPr>
-        <w:pStyle w:val="ListBullet"/>
-      </w:pPr>
+        <w:t>, l'</w:t>
+      </w:r>
+      <w:r>
+        <w:rPr>
+          <w:rFonts w:ascii="Calibri" w:hAnsi="Calibri"/>
+          <w:b/>
+          <w:i w:val="0"/>
+        </w:rPr>
+        <w:t>adéquation</w:t>
+      </w:r>
       <w:r>
         <w:rPr>
           <w:rFonts w:ascii="Calibri" w:hAnsi="Calibri"/>
           <w:b w:val="0"/>
           <w:i w:val="0"/>
         </w:rPr>
-        <w:t>Modifications du contexte interne et externe</w:t>
-      </w:r>
-    </w:p>
-    <w:p>
-      <w:pPr>
-        <w:pStyle w:val="ListBullet"/>
-      </w:pPr>
+        <w:t>, l'</w:t>
+      </w:r>
+      <w:r>
+        <w:rPr>
+          <w:rFonts w:ascii="Calibri" w:hAnsi="Calibri"/>
+          <w:b/>
+          <w:i w:val="0"/>
+        </w:rPr>
+        <w:t>efficacité</w:t>
+      </w:r>
       <w:r>
         <w:rPr>
           <w:rFonts w:ascii="Calibri" w:hAnsi="Calibri"/>
           <w:b w:val="0"/>
           <w:i w:val="0"/>
         </w:rPr>
-        <w:t>Performance des processus et conformité des produits</w:t>
-      </w:r>
-    </w:p>
-    <w:p>
-      <w:pPr>
-        <w:pStyle w:val="ListBullet"/>
-      </w:pPr>
+        <w:t xml:space="preserve"> et l'</w:t>
+      </w:r>
+      <w:r>
+        <w:rPr>
+          <w:rFonts w:ascii="Calibri" w:hAnsi="Calibri"/>
+          <w:b/>
+          <w:i w:val="0"/>
+        </w:rPr>
+        <w:t>alignement avec la stratégie</w:t>
+      </w:r>
       <w:r>
         <w:rPr>
           <w:rFonts w:ascii="Calibri" w:hAnsi="Calibri"/>
           <w:b w:val="0"/>
           <w:i w:val="0"/>
         </w:rPr>
-        <w:t>Satisfaction des clients européens</w:t>
-      </w:r>
-    </w:p>
-    <w:p>
-      <w:pPr>
-        <w:pStyle w:val="ListBullet"/>
-      </w:pPr>
+        <w:t xml:space="preserve"> de l'entreprise (clause 9.3 renforcée). Des revues intermédiaires peuvent être réalisées en cas d'événement majeur.</w:t>
+      </w:r>
+    </w:p>
+    <w:p>
+      <w:pPr/>
+      <w:r>
+        <w:rPr>
+          <w:rFonts w:ascii="Calibri" w:hAnsi="Calibri"/>
+          <w:b/>
+          <w:i w:val="0"/>
+        </w:rPr>
+        <w:t>6 éléments d'entrée requis (clause 9.3) :</w:t>
+      </w:r>
+    </w:p>
+    <w:p>
+      <w:pPr/>
       <w:r>
         <w:rPr>
           <w:rFonts w:ascii="Calibri" w:hAnsi="Calibri"/>
           <w:b w:val="0"/>
           <w:i w:val="0"/>
         </w:rPr>
-        <w:t>Résultats des audits</w:t>
-      </w:r>
-    </w:p>
-    <w:p>
-      <w:pPr>
-        <w:pStyle w:val="ListBullet"/>
-      </w:pPr>
+        <w:t>a) Résultats des indicateurs (9.1)</w:t>
+      </w:r>
+    </w:p>
+    <w:p>
+      <w:pPr/>
       <w:r>
         <w:rPr>
           <w:rFonts w:ascii="Calibri" w:hAnsi="Calibri"/>
           <w:b w:val="0"/>
           <w:i w:val="0"/>
         </w:rPr>
-        <w:t>Performance des fournisseurs (Yuyao Mould Factory, Whang)</w:t>
-      </w:r>
-    </w:p>
-    <w:p>
-      <w:pPr>
-        <w:pStyle w:val="ListBullet"/>
-      </w:pPr>
+        <w:t>b) État des actions correctives (10.2)</w:t>
+      </w:r>
+    </w:p>
+    <w:p>
+      <w:pPr/>
       <w:r>
         <w:rPr>
           <w:rFonts w:ascii="Calibri" w:hAnsi="Calibri"/>
           <w:b w:val="0"/>
           <w:i w:val="0"/>
         </w:rPr>
-        <w:t>Adéquation des ressources</w:t>
-      </w:r>
-    </w:p>
-    <w:p>
-      <w:pPr>
-        <w:pStyle w:val="ListBullet"/>
-      </w:pPr>
+        <w:t>c) État des risques et opportunités (6.1)</w:t>
+      </w:r>
+    </w:p>
+    <w:p>
+      <w:pPr/>
       <w:r>
         <w:rPr>
           <w:rFonts w:ascii="Calibri" w:hAnsi="Calibri"/>
           <w:b w:val="0"/>
           <w:i w:val="0"/>
         </w:rPr>
-        <w:t>Efficacité des actions face aux risques et opportunités</w:t>
-      </w:r>
-    </w:p>
-    <w:p>
-      <w:pPr>
-        <w:pStyle w:val="ListBullet"/>
-      </w:pPr>
+        <w:t>d) Performance des partenaires industriels (8.4)</w:t>
+      </w:r>
+    </w:p>
+    <w:p>
+      <w:pPr/>
       <w:r>
         <w:rPr>
           <w:rFonts w:ascii="Calibri" w:hAnsi="Calibri"/>
           <w:b w:val="0"/>
           <w:i w:val="0"/>
         </w:rPr>
-        <w:t>Opportunités d'amélioration</w:t>
+        <w:t>e) Ressources (chapitre 7)</w:t>
       </w:r>
     </w:p>
     <w:p>
@@ -9806,7 +10483,26 @@
           <w:b w:val="0"/>
           <w:i w:val="0"/>
         </w:rPr>
-        <w:t>Les données de sortie comprennent les decisions relatives à l'amélioration du SMQ, aux besoins en ressources et aux actions a mener.</w:t>
+        <w:t>f) Opportunités d'amélioration (10.3)</w:t>
+      </w:r>
+    </w:p>
+    <w:p>
+      <w:pPr/>
+      <w:r>
+        <w:rPr>
+          <w:rFonts w:ascii="Calibri" w:hAnsi="Calibri"/>
+          <w:b/>
+          <w:i w:val="0"/>
+        </w:rPr>
+        <w:t>Décisions et actions issues de la revue :</w:t>
+      </w:r>
+      <w:r>
+        <w:rPr>
+          <w:rFonts w:ascii="Calibri" w:hAnsi="Calibri"/>
+          <w:b w:val="0"/>
+          <w:i w:val="0"/>
+        </w:rPr>
+        <w:t xml:space="preserve"> définir de nouveaux objectifs qualité si nécessaire, décider d'actions correctives ou préventives, renforcer la sélection ou le suivi des fournisseurs, ajuster les processus opérationnels, planifier les améliorations prioritaires. Les décisions sont formalisées dans le compte rendu de revue de direction.</w:t>
       </w:r>
     </w:p>
     <w:p>
@@ -9992,7 +10688,7 @@
           <w:b/>
           <w:i w:val="0"/>
         </w:rPr>
-        <w:t>Processus de traitement :</w:t>
+        <w:t>Processus de traitement (clause 10.2) :</w:t>
       </w:r>
     </w:p>
     <w:p>
@@ -10005,7 +10701,7 @@
           <w:b w:val="0"/>
           <w:i w:val="0"/>
         </w:rPr>
-        <w:t>Enregistrement dans une fiche de NC</w:t>
+        <w:t>Analyse de la cause racine</w:t>
       </w:r>
     </w:p>
     <w:p>
@@ -10018,7 +10714,7 @@
           <w:b w:val="0"/>
           <w:i w:val="0"/>
         </w:rPr>
-        <w:t>Analyse de la situation et des causes</w:t>
+        <w:t>Identification du type de cause (5 types : défaut production, erreur humaine, étiquetage, logistique, clarification)</w:t>
       </w:r>
     </w:p>
     <w:p>
@@ -10031,7 +10727,7 @@
           <w:b w:val="0"/>
           <w:i w:val="0"/>
         </w:rPr>
-        <w:t>Decision de traitement : acceptation, correction ou remplacement</w:t>
+        <w:t>Action corrective adaptée (5 types : correction production, renforcement CQ, reprise étiquetage, adaptation logistique, amélioration communication)</w:t>
       </w:r>
     </w:p>
     <w:p>
@@ -10081,6 +10777,25 @@
           <w:b/>
           <w:i w:val="0"/>
         </w:rPr>
+        <w:t>Registre des actions correctives</w:t>
+      </w:r>
+      <w:r>
+        <w:rPr>
+          <w:rFonts w:ascii="Calibri" w:hAnsi="Calibri"/>
+          <w:b w:val="0"/>
+          <w:i w:val="0"/>
+        </w:rPr>
+        <w:t xml:space="preserve"> par catégorie (fournisseurs, transporteurs, client) dans FileMaker. Si récurrence d'une NC identique : analyse approfondie et actions renforcées.</w:t>
+      </w:r>
+    </w:p>
+    <w:p>
+      <w:pPr/>
+      <w:r>
+        <w:rPr>
+          <w:rFonts w:ascii="Calibri" w:hAnsi="Calibri"/>
+          <w:b/>
+          <w:i w:val="0"/>
+        </w:rPr>
         <w:t>NC enregistrée en 2026 :</w:t>
       </w:r>
       <w:r>
@@ -10119,7 +10834,18 @@
           <w:b w:val="0"/>
           <w:i w:val="0"/>
         </w:rPr>
-        <w:t>L'amélioration continue est alimentee par :</w:t>
+        <w:t>L'amélioration continue (clause 10.3) vise 5 objectifs : réduire les NC, optimiser les délais, renforcer la qualité, améliorer la satisfaction client, fiabiliser la chaîne logistique.</w:t>
+      </w:r>
+    </w:p>
+    <w:p>
+      <w:pPr/>
+      <w:r>
+        <w:rPr>
+          <w:rFonts w:ascii="Calibri" w:hAnsi="Calibri"/>
+          <w:b/>
+          <w:i w:val="0"/>
+        </w:rPr>
+        <w:t>Déclencheurs d'amélioration :</w:t>
       </w:r>
     </w:p>
     <w:p>
@@ -10132,7 +10858,7 @@
           <w:b w:val="0"/>
           <w:i w:val="0"/>
         </w:rPr>
-        <w:t>les résultats des audits internes</w:t>
+        <w:t>Non-conformité détectée ou récurrente</w:t>
       </w:r>
     </w:p>
     <w:p>
@@ -10145,7 +10871,7 @@
           <w:b w:val="0"/>
           <w:i w:val="0"/>
         </w:rPr>
-        <w:t>l'analyse des indicateurs de performance</w:t>
+        <w:t>Retard de livraison constaté</w:t>
       </w:r>
     </w:p>
     <w:p>
@@ -10158,7 +10884,7 @@
           <w:b w:val="0"/>
           <w:i w:val="0"/>
         </w:rPr>
-        <w:t>les retours clients et les réclamations</w:t>
+        <w:t>Retour ou réclamation client</w:t>
       </w:r>
     </w:p>
     <w:p>
@@ -10171,20 +10897,28 @@
           <w:b w:val="0"/>
           <w:i w:val="0"/>
         </w:rPr>
-        <w:t>les résultats de la revue de direction</w:t>
+        <w:t>Indicateurs qualité en dessous des cibles</w:t>
       </w:r>
     </w:p>
     <w:p>
       <w:pPr>
         <w:pStyle w:val="ListBullet"/>
       </w:pPr>
+      <w:r>
+        <w:rPr>
+          <w:rFonts w:ascii="Calibri" w:hAnsi="Calibri"/>
+          <w:b/>
+          <w:i w:val="0"/>
+        </w:rPr>
+        <w:t>Visites en Chine</w:t>
+      </w:r>
       <w:r>
         <w:rPr>
           <w:rFonts w:ascii="Calibri" w:hAnsi="Calibri"/>
           <w:b w:val="0"/>
           <w:i w:val="0"/>
         </w:rPr>
-        <w:t>les actions correctives mises en œuvre</w:t>
+        <w:t xml:space="preserve"> — levier majeur d'amélioration (formalisation du suivi production, contrôle qualité sur site, renforcement relation partenaires)</w:t>
       </w:r>
     </w:p>
     <w:p>
@@ -10195,7 +10929,18 @@
           <w:b w:val="0"/>
           <w:i w:val="0"/>
         </w:rPr>
-        <w:t>Les decisions d'amélioration sont prises lors de la revue de direction et intégrées dans la planification des objectifs qualité.</w:t>
+        <w:t>L'efficacité des améliorations est vérifiée selon 4 critères : disparition du problème, amélioration des indicateurs, satisfaction des parties, absence de récurrence.</w:t>
+      </w:r>
+    </w:p>
+    <w:p>
+      <w:pPr/>
+      <w:r>
+        <w:rPr>
+          <w:rFonts w:ascii="Calibri" w:hAnsi="Calibri"/>
+          <w:b w:val="0"/>
+          <w:i w:val="0"/>
+        </w:rPr>
+        <w:t>Les décisions d'amélioration sont consolidées lors de la revue de direction annuelle et intégrées dans la planification des objectifs qualité.</w:t>
       </w:r>
     </w:p>
     <w:p>
@@ -11307,7 +12052,7 @@
                 <w:i w:val="0"/>
                 <w:sz w:val="18"/>
               </w:rPr>
-              <w:t>Contrôle Reception</w:t>
+              <w:t>Contrôle Réception</w:t>
             </w:r>
           </w:p>
         </w:tc>
@@ -11326,6 +12071,109 @@
                 <w:sz w:val="18"/>
               </w:rPr>
               <w:t>21</w:t>
+            </w:r>
+          </w:p>
+        </w:tc>
+        <w:tc>
+          <w:tcPr>
+            <w:tcW w:type="dxa" w:w="3213"/>
+          </w:tcPr>
+          <w:p>
+            <w:r>
+              <w:rPr>
+                <w:rFonts w:ascii="Calibri" w:hAnsi="Calibri"/>
+                <w:b w:val="0"/>
+                <w:i w:val="0"/>
+                <w:sz w:val="18"/>
+              </w:rPr>
+              <w:t>FOR-AQF-001</w:t>
+            </w:r>
+          </w:p>
+        </w:tc>
+        <w:tc>
+          <w:tcPr>
+            <w:tcW w:type="dxa" w:w="3213"/>
+          </w:tcPr>
+          <w:p>
+            <w:r>
+              <w:rPr>
+                <w:rFonts w:ascii="Calibri" w:hAnsi="Calibri"/>
+                <w:b w:val="0"/>
+                <w:i w:val="0"/>
+                <w:sz w:val="18"/>
+              </w:rPr>
+              <w:t>Accord Qualité — Hardeng Yuyao Mould Factory</w:t>
+            </w:r>
+          </w:p>
+        </w:tc>
+      </w:tr>
+      <w:tr>
+        <w:tc>
+          <w:tcPr>
+            <w:tcW w:type="dxa" w:w="3213"/>
+            <w:shd w:fill="F0F4F8"/>
+          </w:tcPr>
+          <w:p>
+            <w:r>
+              <w:rPr>
+                <w:rFonts w:ascii="Calibri" w:hAnsi="Calibri"/>
+                <w:b w:val="0"/>
+                <w:i w:val="0"/>
+                <w:sz w:val="18"/>
+              </w:rPr>
+              <w:t>22</w:t>
+            </w:r>
+          </w:p>
+        </w:tc>
+        <w:tc>
+          <w:tcPr>
+            <w:tcW w:type="dxa" w:w="3213"/>
+            <w:shd w:fill="F0F4F8"/>
+          </w:tcPr>
+          <w:p>
+            <w:r>
+              <w:rPr>
+                <w:rFonts w:ascii="Calibri" w:hAnsi="Calibri"/>
+                <w:b w:val="0"/>
+                <w:i w:val="0"/>
+                <w:sz w:val="18"/>
+              </w:rPr>
+              <w:t>FOR-AQF-002</w:t>
+            </w:r>
+          </w:p>
+        </w:tc>
+        <w:tc>
+          <w:tcPr>
+            <w:tcW w:type="dxa" w:w="3213"/>
+            <w:shd w:fill="F0F4F8"/>
+          </w:tcPr>
+          <w:p>
+            <w:r>
+              <w:rPr>
+                <w:rFonts w:ascii="Calibri" w:hAnsi="Calibri"/>
+                <w:b w:val="0"/>
+                <w:i w:val="0"/>
+                <w:sz w:val="18"/>
+              </w:rPr>
+              <w:t>Accord Qualité — Oukailuo</w:t>
+            </w:r>
+          </w:p>
+        </w:tc>
+      </w:tr>
+      <w:tr>
+        <w:tc>
+          <w:tcPr>
+            <w:tcW w:type="dxa" w:w="3213"/>
+          </w:tcPr>
+          <w:p>
+            <w:r>
+              <w:rPr>
+                <w:rFonts w:ascii="Calibri" w:hAnsi="Calibri"/>
+                <w:b w:val="0"/>
+                <w:i w:val="0"/>
+                <w:sz w:val="18"/>
+              </w:rPr>
+              <w:t>23</w:t>
             </w:r>
           </w:p>
         </w:tc>
@@ -11595,6 +12443,76 @@
           </w:p>
         </w:tc>
       </w:tr>
+      <w:tr>
+        <w:tc>
+          <w:tcPr>
+            <w:tcW w:type="dxa" w:w="2409"/>
+            <w:shd w:fill="F0F4F8"/>
+          </w:tcPr>
+          <w:p>
+            <w:r>
+              <w:rPr>
+                <w:rFonts w:ascii="Calibri" w:hAnsi="Calibri"/>
+                <w:b w:val="0"/>
+                <w:i w:val="0"/>
+                <w:sz w:val="18"/>
+              </w:rPr>
+              <w:t>0.4</w:t>
+            </w:r>
+          </w:p>
+        </w:tc>
+        <w:tc>
+          <w:tcPr>
+            <w:tcW w:type="dxa" w:w="2409"/>
+            <w:shd w:fill="F0F4F8"/>
+          </w:tcPr>
+          <w:p>
+            <w:r>
+              <w:rPr>
+                <w:rFonts w:ascii="Calibri" w:hAnsi="Calibri"/>
+                <w:b w:val="0"/>
+                <w:i w:val="0"/>
+                <w:sz w:val="18"/>
+              </w:rPr>
+              <w:t>22/02/2026</w:t>
+            </w:r>
+          </w:p>
+        </w:tc>
+        <w:tc>
+          <w:tcPr>
+            <w:tcW w:type="dxa" w:w="2409"/>
+            <w:shd w:fill="F0F4F8"/>
+          </w:tcPr>
+          <w:p>
+            <w:r>
+              <w:rPr>
+                <w:rFonts w:ascii="Calibri" w:hAnsi="Calibri"/>
+                <w:b w:val="0"/>
+                <w:i w:val="0"/>
+                <w:sz w:val="18"/>
+              </w:rPr>
+              <w:t>Mise à jour complète : intégration UPDATEs 7.5-8.7 (U17-U23), UPDATEs 9.1/10.2/10.3/9.3 (U24-U27) et RECAP 13 points. Enrichissements majeurs : 6 types d'exigences (8.2), 7 critères sélection + 4 indicateurs (8.4), 4 moyens conformité (8.5), 3 critères libération (8.6), processus NC 4 étapes (8.7), 5 volets suivi/mesure (9.1), 5 types de causes NC (10.2), amélioration continue 10.3, revue direction renforcée 9.3. Résolutions RECAP : auditeur Capucine &amp; Olav Wicky, diplômes Roxane, Gramatec SA, ECAM/Sofia, accords qualité FOR-AQF-001/002. Total : 26 documents SMQ.</w:t>
+            </w:r>
+          </w:p>
+        </w:tc>
+        <w:tc>
+          <w:tcPr>
+            <w:tcW w:type="dxa" w:w="2409"/>
+            <w:shd w:fill="F0F4F8"/>
+          </w:tcPr>
+          <w:p>
+            <w:r>
+              <w:rPr>
+                <w:rFonts w:ascii="Calibri" w:hAnsi="Calibri"/>
+                <w:b w:val="0"/>
+                <w:i w:val="0"/>
+                <w:sz w:val="18"/>
+              </w:rPr>
+              <w:t>Roxane Wicky</w:t>
+            </w:r>
+          </w:p>
+        </w:tc>
+      </w:tr>
     </w:tbl>
     <w:p/>
     <w:p>
@@ -11616,7 +12534,7 @@
           <w:b w:val="0"/>
           <w:i/>
         </w:rPr>
-        <w:t>Document de travail — Version 0.4 — Plus Sarl, Cudrefin, Suisse.</w:t>
+        <w:t>Document de travail — Version 0.4 (mise à jour 22/02/2026) — Plus Sarl, Cudrefin, Suisse.</w:t>
       </w:r>
     </w:p>
     <w:p>
@@ -11925,7 +12843,7 @@
                 <w:i w:val="0"/>
                 <w:sz w:val="18"/>
               </w:rPr>
-              <w:t>20/02/2026</w:t>
+              <w:t>22/02/2026</w:t>
             </w:r>
           </w:p>
         </w:tc>
@@ -12154,7 +13072,7 @@
                 <w:i w:val="0"/>
                 <w:sz w:val="18"/>
               </w:rPr>
-              <w:t>24 documents</w:t>
+              <w:t>26 documents</w:t>
             </w:r>
           </w:p>
         </w:tc>
@@ -13708,7 +14626,7 @@
                 <w:i w:val="0"/>
                 <w:sz w:val="18"/>
               </w:rPr>
-              <w:t>(partiellement — diplomes )</w:t>
+              <w:t>(diplômes et expérience documentés)</w:t>
             </w:r>
           </w:p>
         </w:tc>
@@ -14557,7 +15475,7 @@
                 <w:i w:val="0"/>
                 <w:sz w:val="18"/>
               </w:rPr>
-              <w:t>PRO-ACH-001, FIC-PRO-001, FOR-EVF-001</w:t>
+              <w:t>PRO-ACH-001, FIC-PRO-001, FOR-EVF-001, FOR-AQF-001, FOR-AQF-002</w:t>
             </w:r>
           </w:p>
         </w:tc>
@@ -14573,7 +15491,7 @@
                 <w:i w:val="0"/>
                 <w:sz w:val="18"/>
               </w:rPr>
-              <w:t>Documents complets</w:t>
+              <w:t>Documents complets (accords qualité formalisés)</w:t>
             </w:r>
           </w:p>
         </w:tc>
@@ -15059,7 +15977,7 @@
                 <w:i w:val="0"/>
                 <w:sz w:val="18"/>
               </w:rPr>
-              <w:t>OBJ §2 (tableau de bord), FOR-SAT</w:t>
+              <w:t>OBJ §2 (tableau de bord), §4 (5 volets 9.1), FOR-SAT</w:t>
             </w:r>
           </w:p>
         </w:tc>
@@ -15532,7 +16450,7 @@
                 <w:i w:val="0"/>
                 <w:sz w:val="18"/>
               </w:rPr>
-              <w:t>PRO-NCF-001, PRO-ACR-001, FOR-RCL-001</w:t>
+              <w:t>PRO-NCF-001 (§11), PRO-ACR-001, FOR-RCL-001</w:t>
             </w:r>
           </w:p>
         </w:tc>
@@ -15549,7 +16467,7 @@
                 <w:i w:val="0"/>
                 <w:sz w:val="18"/>
               </w:rPr>
-              <w:t>Documents complets</w:t>
+              <w:t>5 types de causes, registre AC, actions correctives</w:t>
             </w:r>
           </w:p>
         </w:tc>
@@ -15606,7 +16524,7 @@
                 <w:i w:val="0"/>
                 <w:sz w:val="18"/>
               </w:rPr>
-              <w:t>CRT-QUA-001, FOR-RDR-001</w:t>
+              <w:t>PRO-ACR-001 (§9), CRT-QUA-001, FOR-RDR-001</w:t>
             </w:r>
           </w:p>
         </w:tc>
@@ -15622,7 +16540,7 @@
                 <w:i w:val="0"/>
                 <w:sz w:val="18"/>
               </w:rPr>
-              <w:t>M2 processus, revue de direction</w:t>
+              <w:t>Déclencheurs, visites Chine, vérification efficacité</w:t>
             </w:r>
           </w:p>
         </w:tc>
@@ -17270,7 +18188,7 @@
                 <w:i w:val="0"/>
                 <w:sz w:val="18"/>
               </w:rPr>
-              <w:t>Contrôle Reception</w:t>
+              <w:t>Contrôle Réception</w:t>
             </w:r>
           </w:p>
         </w:tc>
@@ -17288,6 +18206,142 @@
                 <w:sz w:val="18"/>
               </w:rPr>
               <w:t>8.6</w:t>
+            </w:r>
+          </w:p>
+        </w:tc>
+      </w:tr>
+      <w:tr>
+        <w:tc>
+          <w:tcPr>
+            <w:tcW w:type="dxa" w:w="2409"/>
+          </w:tcPr>
+          <w:p>
+            <w:r>
+              <w:rPr>
+                <w:rFonts w:ascii="Calibri" w:hAnsi="Calibri"/>
+                <w:b w:val="0"/>
+                <w:i w:val="0"/>
+                <w:sz w:val="18"/>
+              </w:rPr>
+              <w:t>21</w:t>
+            </w:r>
+          </w:p>
+        </w:tc>
+        <w:tc>
+          <w:tcPr>
+            <w:tcW w:type="dxa" w:w="2409"/>
+          </w:tcPr>
+          <w:p>
+            <w:r>
+              <w:rPr>
+                <w:rFonts w:ascii="Calibri" w:hAnsi="Calibri"/>
+                <w:b w:val="0"/>
+                <w:i w:val="0"/>
+                <w:sz w:val="18"/>
+              </w:rPr>
+              <w:t>FOR-AQF-001</w:t>
+            </w:r>
+          </w:p>
+        </w:tc>
+        <w:tc>
+          <w:tcPr>
+            <w:tcW w:type="dxa" w:w="2409"/>
+          </w:tcPr>
+          <w:p>
+            <w:r>
+              <w:rPr>
+                <w:rFonts w:ascii="Calibri" w:hAnsi="Calibri"/>
+                <w:b w:val="0"/>
+                <w:i w:val="0"/>
+                <w:sz w:val="18"/>
+              </w:rPr>
+              <w:t>Accord Qualité — Hardeng Yuyao Mould Factory</w:t>
+            </w:r>
+          </w:p>
+        </w:tc>
+        <w:tc>
+          <w:tcPr>
+            <w:tcW w:type="dxa" w:w="2409"/>
+          </w:tcPr>
+          <w:p>
+            <w:r>
+              <w:rPr>
+                <w:rFonts w:ascii="Calibri" w:hAnsi="Calibri"/>
+                <w:b w:val="0"/>
+                <w:i w:val="0"/>
+                <w:sz w:val="18"/>
+              </w:rPr>
+              <w:t>8.4</w:t>
+            </w:r>
+          </w:p>
+        </w:tc>
+      </w:tr>
+      <w:tr>
+        <w:tc>
+          <w:tcPr>
+            <w:tcW w:type="dxa" w:w="2409"/>
+            <w:shd w:fill="F0F4F8"/>
+          </w:tcPr>
+          <w:p>
+            <w:r>
+              <w:rPr>
+                <w:rFonts w:ascii="Calibri" w:hAnsi="Calibri"/>
+                <w:b w:val="0"/>
+                <w:i w:val="0"/>
+                <w:sz w:val="18"/>
+              </w:rPr>
+              <w:t>22</w:t>
+            </w:r>
+          </w:p>
+        </w:tc>
+        <w:tc>
+          <w:tcPr>
+            <w:tcW w:type="dxa" w:w="2409"/>
+            <w:shd w:fill="F0F4F8"/>
+          </w:tcPr>
+          <w:p>
+            <w:r>
+              <w:rPr>
+                <w:rFonts w:ascii="Calibri" w:hAnsi="Calibri"/>
+                <w:b w:val="0"/>
+                <w:i w:val="0"/>
+                <w:sz w:val="18"/>
+              </w:rPr>
+              <w:t>FOR-AQF-002</w:t>
+            </w:r>
+          </w:p>
+        </w:tc>
+        <w:tc>
+          <w:tcPr>
+            <w:tcW w:type="dxa" w:w="2409"/>
+            <w:shd w:fill="F0F4F8"/>
+          </w:tcPr>
+          <w:p>
+            <w:r>
+              <w:rPr>
+                <w:rFonts w:ascii="Calibri" w:hAnsi="Calibri"/>
+                <w:b w:val="0"/>
+                <w:i w:val="0"/>
+                <w:sz w:val="18"/>
+              </w:rPr>
+              <w:t>Accord Qualité — Oukailuo</w:t>
+            </w:r>
+          </w:p>
+        </w:tc>
+        <w:tc>
+          <w:tcPr>
+            <w:tcW w:type="dxa" w:w="2409"/>
+            <w:shd w:fill="F0F4F8"/>
+          </w:tcPr>
+          <w:p>
+            <w:r>
+              <w:rPr>
+                <w:rFonts w:ascii="Calibri" w:hAnsi="Calibri"/>
+                <w:b w:val="0"/>
+                <w:i w:val="0"/>
+                <w:sz w:val="18"/>
+              </w:rPr>
+              <w:t>8.4</w:t>
             </w:r>
           </w:p>
         </w:tc>
@@ -17402,7 +18456,7 @@
                 <w:i w:val="0"/>
                 <w:sz w:val="18"/>
               </w:rPr>
-              <w:t>21</w:t>
+              <w:t>23</w:t>
             </w:r>
           </w:p>
         </w:tc>
@@ -17546,7 +18600,7 @@
                 <w:i w:val="0"/>
                 <w:sz w:val="18"/>
               </w:rPr>
-              <w:t>22</w:t>
+              <w:t>24</w:t>
             </w:r>
           </w:p>
         </w:tc>
@@ -17597,7 +18651,7 @@
                 <w:i w:val="0"/>
                 <w:sz w:val="18"/>
               </w:rPr>
-              <w:t>23</w:t>
+              <w:t>25</w:t>
             </w:r>
           </w:p>
         </w:tc>
@@ -17649,7 +18703,7 @@
                 <w:i w:val="0"/>
                 <w:sz w:val="18"/>
               </w:rPr>
-              <w:t>24</w:t>
+              <w:t>26</w:t>
             </w:r>
           </w:p>
         </w:tc>
@@ -17681,7 +18735,7 @@
                 <w:i w:val="0"/>
                 <w:sz w:val="18"/>
               </w:rPr>
-              <w:t>Suivi des informations et mises a jour</w:t>
+              <w:t>Suivi des informations et mises à jour</w:t>
             </w:r>
           </w:p>
         </w:tc>
@@ -17820,7 +18874,7 @@
                 <w:i w:val="0"/>
                 <w:sz w:val="18"/>
               </w:rPr>
-              <w:t>Diplomes et formations de la gérante</w:t>
+              <w:t>~~Diplômes et formations de la gérante~~</w:t>
             </w:r>
           </w:p>
         </w:tc>
@@ -17852,7 +18906,7 @@
                 <w:i w:val="0"/>
                 <w:sz w:val="18"/>
               </w:rPr>
-              <w:t>Non divulgues à ce stade — a fournir avant l'audit</w:t>
+              <w:t>Résolu — diplômes et expériences documentés (RECAP point #7)</w:t>
             </w:r>
           </w:p>
         </w:tc>
@@ -17888,7 +18942,7 @@
                 <w:i w:val="0"/>
                 <w:sz w:val="18"/>
               </w:rPr>
-              <w:t>Expérience professionnelle antérieure</w:t>
+              <w:t>~~Expérience professionnelle antérieure~~</w:t>
             </w:r>
           </w:p>
         </w:tc>
@@ -17922,7 +18976,7 @@
                 <w:i w:val="0"/>
                 <w:sz w:val="18"/>
               </w:rPr>
-              <w:t>Non divulguee — a completer</w:t>
+              <w:t>Résolu — assistante direction 2013-2016, gérante 2016-présent</w:t>
             </w:r>
           </w:p>
         </w:tc>
@@ -17988,7 +19042,7 @@
                 <w:i w:val="0"/>
                 <w:sz w:val="18"/>
               </w:rPr>
-              <w:t>A remplir (notes 1-5)</w:t>
+              <w:t>À remplir (notes 1-5)</w:t>
             </w:r>
           </w:p>
         </w:tc>
@@ -18058,7 +19112,7 @@
                 <w:i w:val="0"/>
                 <w:sz w:val="18"/>
               </w:rPr>
-              <w:t>A completer avec les formations passees</w:t>
+              <w:t>À compléter avec les formations passées</w:t>
             </w:r>
           </w:p>
         </w:tc>
@@ -18194,7 +19248,7 @@
                 <w:i w:val="0"/>
                 <w:sz w:val="18"/>
               </w:rPr>
-              <w:t>A formaliser avec Yuyao Mould Factory</w:t>
+              <w:t>À formaliser lors du voyage en Chine mars 2026</w:t>
             </w:r>
           </w:p>
         </w:tc>
@@ -18219,7 +19273,7 @@
           <w:b w:val="0"/>
           <w:i w:val="0"/>
         </w:rPr>
-        <w:t>Structure documentaire complète (24 documents) couvrant tous les chapitres ISO 9001</w:t>
+        <w:t>Structure documentaire complète (26 documents) couvrant tous les chapitres ISO 9001</w:t>
       </w:r>
     </w:p>
     <w:p>
@@ -18284,7 +19338,7 @@
           <w:b w:val="0"/>
           <w:i w:val="0"/>
         </w:rPr>
-        <w:t>Politique qualité signee par la direction</w:t>
+        <w:t>Politique qualité signée par la direction</w:t>
       </w:r>
     </w:p>
     <w:p>
@@ -18297,7 +19351,7 @@
           <w:b w:val="0"/>
           <w:i w:val="0"/>
         </w:rPr>
-        <w:t>Communication externe structuree par partie intéressée</w:t>
+        <w:t>Communication externe structurée par partie intéressée</w:t>
       </w:r>
     </w:p>
     <w:p>
@@ -18311,6 +19365,71 @@
           <w:i w:val="0"/>
         </w:rPr>
         <w:t>Exclusion 8.3 clairement justifiée</w:t>
+      </w:r>
+    </w:p>
+    <w:p>
+      <w:pPr>
+        <w:pStyle w:val="ListBullet"/>
+      </w:pPr>
+      <w:r>
+        <w:rPr>
+          <w:rFonts w:ascii="Calibri" w:hAnsi="Calibri"/>
+          <w:b w:val="0"/>
+          <w:i w:val="0"/>
+        </w:rPr>
+        <w:t>Auditeur interne identifié : Capucine &amp; Olav Wicky (exigence d'indépendance satisfaite)</w:t>
+      </w:r>
+    </w:p>
+    <w:p>
+      <w:pPr>
+        <w:pStyle w:val="ListBullet"/>
+      </w:pPr>
+      <w:r>
+        <w:rPr>
+          <w:rFonts w:ascii="Calibri" w:hAnsi="Calibri"/>
+          <w:b w:val="0"/>
+          <w:i w:val="0"/>
+        </w:rPr>
+        <w:t>Accords qualité formalisés avec les 2 partenaires chinois (FOR-AQF-001/002)</w:t>
+      </w:r>
+    </w:p>
+    <w:p>
+      <w:pPr>
+        <w:pStyle w:val="ListBullet"/>
+      </w:pPr>
+      <w:r>
+        <w:rPr>
+          <w:rFonts w:ascii="Calibri" w:hAnsi="Calibri"/>
+          <w:b w:val="0"/>
+          <w:i w:val="0"/>
+        </w:rPr>
+        <w:t>Sauvegarde identifiée : Gramatec SA (Suisse), enregistrement automatique</w:t>
+      </w:r>
+    </w:p>
+    <w:p>
+      <w:pPr>
+        <w:pStyle w:val="ListBullet"/>
+      </w:pPr>
+      <w:r>
+        <w:rPr>
+          <w:rFonts w:ascii="Calibri" w:hAnsi="Calibri"/>
+          <w:b w:val="0"/>
+          <w:i w:val="0"/>
+        </w:rPr>
+        <w:t>Diplômes et expérience de la gérante documentés</w:t>
+      </w:r>
+    </w:p>
+    <w:p>
+      <w:pPr>
+        <w:pStyle w:val="ListBullet"/>
+      </w:pPr>
+      <w:r>
+        <w:rPr>
+          <w:rFonts w:ascii="Calibri" w:hAnsi="Calibri"/>
+          <w:b w:val="0"/>
+          <w:i w:val="0"/>
+        </w:rPr>
+        <w:t>Transporteur principal identifié : ECAM, contact Sofia</w:t>
       </w:r>
     </w:p>
     <w:p>
@@ -18418,7 +19537,7 @@
                 <w:i w:val="0"/>
                 <w:sz w:val="18"/>
               </w:rPr>
-              <w:t>Completer les informations sur les diplomes et formations (FOR-CMP-001)</w:t>
+              <w:t>~~Compléter les diplômes et formations~~</w:t>
             </w:r>
           </w:p>
         </w:tc>
@@ -18434,7 +19553,7 @@
                 <w:i w:val="0"/>
                 <w:sz w:val="18"/>
               </w:rPr>
-              <w:t>Haute</w:t>
+              <w:t>~~Haute~~  Résolu</w:t>
             </w:r>
           </w:p>
         </w:tc>
@@ -18573,7 +19692,7 @@
                 <w:i w:val="0"/>
                 <w:sz w:val="18"/>
               </w:rPr>
-              <w:t>Mandater un auditeur interne externe (clause 9.2.2 c)</w:t>
+              <w:t>~~Mandater un auditeur interne~~</w:t>
             </w:r>
           </w:p>
         </w:tc>
@@ -18590,7 +19709,7 @@
                 <w:i w:val="0"/>
                 <w:sz w:val="18"/>
               </w:rPr>
-              <w:t>Recommandé</w:t>
+              <w:t>~~Recommandé~~  Capucine &amp; Olav Wicky</w:t>
             </w:r>
           </w:p>
         </w:tc>
@@ -18624,7 +19743,7 @@
                 <w:i w:val="0"/>
                 <w:sz w:val="18"/>
               </w:rPr>
-              <w:t>Formaliser la fiche de contrôle qualité avec les partenaires chinois</w:t>
+              <w:t>Formaliser la fiche de contrôle qualité avec les partenaires (voyage Chine mars 2026)</w:t>
             </w:r>
           </w:p>
         </w:tc>
@@ -18677,6 +19796,109 @@
                 <w:sz w:val="18"/>
               </w:rPr>
               <w:t>Commencer le suivi trimestriel des indicateurs (OBJ-QUA-001)</w:t>
+            </w:r>
+          </w:p>
+        </w:tc>
+        <w:tc>
+          <w:tcPr>
+            <w:tcW w:type="dxa" w:w="3213"/>
+            <w:shd w:fill="F0F4F8"/>
+          </w:tcPr>
+          <w:p>
+            <w:r>
+              <w:rPr>
+                <w:rFonts w:ascii="Calibri" w:hAnsi="Calibri"/>
+                <w:b w:val="0"/>
+                <w:i w:val="0"/>
+                <w:sz w:val="18"/>
+              </w:rPr>
+              <w:t>Haute</w:t>
+            </w:r>
+          </w:p>
+        </w:tc>
+      </w:tr>
+      <w:tr>
+        <w:tc>
+          <w:tcPr>
+            <w:tcW w:type="dxa" w:w="3213"/>
+          </w:tcPr>
+          <w:p>
+            <w:r>
+              <w:rPr>
+                <w:rFonts w:ascii="Calibri" w:hAnsi="Calibri"/>
+                <w:b w:val="0"/>
+                <w:i w:val="0"/>
+                <w:sz w:val="18"/>
+              </w:rPr>
+              <w:t>7</w:t>
+            </w:r>
+          </w:p>
+        </w:tc>
+        <w:tc>
+          <w:tcPr>
+            <w:tcW w:type="dxa" w:w="3213"/>
+          </w:tcPr>
+          <w:p>
+            <w:r>
+              <w:rPr>
+                <w:rFonts w:ascii="Calibri" w:hAnsi="Calibri"/>
+                <w:b w:val="0"/>
+                <w:i w:val="0"/>
+                <w:sz w:val="18"/>
+              </w:rPr>
+              <w:t>Faire signer les accords qualité FOR-AQF-001/002 (voyage Chine mars 2026)</w:t>
+            </w:r>
+          </w:p>
+        </w:tc>
+        <w:tc>
+          <w:tcPr>
+            <w:tcW w:type="dxa" w:w="3213"/>
+          </w:tcPr>
+          <w:p>
+            <w:r>
+              <w:rPr>
+                <w:rFonts w:ascii="Calibri" w:hAnsi="Calibri"/>
+                <w:b w:val="0"/>
+                <w:i w:val="0"/>
+                <w:sz w:val="18"/>
+              </w:rPr>
+              <w:t>Haute</w:t>
+            </w:r>
+          </w:p>
+        </w:tc>
+      </w:tr>
+      <w:tr>
+        <w:tc>
+          <w:tcPr>
+            <w:tcW w:type="dxa" w:w="3213"/>
+            <w:shd w:fill="F0F4F8"/>
+          </w:tcPr>
+          <w:p>
+            <w:r>
+              <w:rPr>
+                <w:rFonts w:ascii="Calibri" w:hAnsi="Calibri"/>
+                <w:b w:val="0"/>
+                <w:i w:val="0"/>
+                <w:sz w:val="18"/>
+              </w:rPr>
+              <w:t>8</w:t>
+            </w:r>
+          </w:p>
+        </w:tc>
+        <w:tc>
+          <w:tcPr>
+            <w:tcW w:type="dxa" w:w="3213"/>
+            <w:shd w:fill="F0F4F8"/>
+          </w:tcPr>
+          <w:p>
+            <w:r>
+              <w:rPr>
+                <w:rFonts w:ascii="Calibri" w:hAnsi="Calibri"/>
+                <w:b w:val="0"/>
+                <w:i w:val="0"/>
+                <w:sz w:val="18"/>
+              </w:rPr>
+              <w:t>Créer le registre NC dans FileMaker (cf. UPDATE 8.7)</w:t>
             </w:r>
           </w:p>
         </w:tc>
@@ -18708,7 +19930,7 @@
           <w:b w:val="0"/>
           <w:i/>
         </w:rPr>
-        <w:t>Index généré le 20/02/2026 — Version de travail v0.4</w:t>
+        <w:t>Index mis à jour le 22/02/2026 — Version de travail v0.4 (27 UPDATEs + RECAP 13 points intégrés)</w:t>
       </w:r>
     </w:p>
     <w:sectPr>

</xml_diff>